<commit_message>
Fix service record docx template: remove 2 blank rows per entry
The {#serviceRecords}/{/serviceRecords} loop tags each lived in their
own filler table row instead of inside the data row, so every real
entry in the exported document was followed by two empty rows. Move
the loop tags into the data row's fromDate/separation cells and drop
the two now-redundant filler rows.

Co-Authored-By: Claude Sonnet 5 <noreply@anthropic.com>
</commit_message>
<xml_diff>
--- a/apps/api/templates/service_record_template.docx
+++ b/apps/api/templates/service_record_template.docx
@@ -1207,7 +1207,7 @@
                 <w:sz w:val="20"/>
                 <w:szCs w:val="24"/>
               </w:rPr>
-              <w:t xml:space="preserve">{#serviceRecords}</w:t>
+              <w:t xml:space="preserve">{#serviceRecords}{fromDate}</w:t>
             </w:r>
           </w:p>
         </w:tc>
@@ -1231,6 +1231,14 @@
                 <w:szCs w:val="24"/>
               </w:rPr>
             </w:pPr>
+            <w:r>
+              <w:rPr>
+                <w:rFonts w:ascii="Book Antiqua" w:eastAsia="Times New Roman" w:hAnsi="Book Antiqua" w:cs="Times New Roman"/>
+                <w:sz w:val="20"/>
+                <w:szCs w:val="24"/>
+              </w:rPr>
+              <w:t xml:space="preserve">{toDate}</w:t>
+            </w:r>
           </w:p>
         </w:tc>
         <w:tc>
@@ -1253,6 +1261,14 @@
                 <w:szCs w:val="24"/>
               </w:rPr>
             </w:pPr>
+            <w:r>
+              <w:rPr>
+                <w:rFonts w:ascii="Book Antiqua" w:eastAsia="Times New Roman" w:hAnsi="Book Antiqua" w:cs="Times New Roman"/>
+                <w:sz w:val="20"/>
+                <w:szCs w:val="24"/>
+              </w:rPr>
+              <w:t>{designation}</w:t>
+            </w:r>
           </w:p>
         </w:tc>
         <w:tc>
@@ -1275,6 +1291,14 @@
                 <w:szCs w:val="24"/>
               </w:rPr>
             </w:pPr>
+            <w:r>
+              <w:rPr>
+                <w:rFonts w:ascii="Book Antiqua" w:eastAsia="Times New Roman" w:hAnsi="Book Antiqua" w:cs="Times New Roman"/>
+                <w:sz w:val="20"/>
+                <w:szCs w:val="24"/>
+              </w:rPr>
+              <w:t>{status}</w:t>
+            </w:r>
           </w:p>
         </w:tc>
         <w:tc>
@@ -1297,6 +1321,14 @@
                 <w:szCs w:val="24"/>
               </w:rPr>
             </w:pPr>
+            <w:r>
+              <w:rPr>
+                <w:rFonts w:ascii="Book Antiqua" w:eastAsia="Times New Roman" w:hAnsi="Book Antiqua" w:cs="Times New Roman"/>
+                <w:sz w:val="20"/>
+                <w:szCs w:val="24"/>
+              </w:rPr>
+              <w:t>{salary}</w:t>
+            </w:r>
           </w:p>
         </w:tc>
         <w:tc>
@@ -1319,6 +1351,14 @@
                 <w:szCs w:val="24"/>
               </w:rPr>
             </w:pPr>
+            <w:r>
+              <w:rPr>
+                <w:rFonts w:ascii="Book Antiqua" w:eastAsia="Times New Roman" w:hAnsi="Book Antiqua" w:cs="Times New Roman"/>
+                <w:sz w:val="20"/>
+                <w:szCs w:val="24"/>
+              </w:rPr>
+              <w:t>{office}</w:t>
+            </w:r>
           </w:p>
         </w:tc>
         <w:tc>
@@ -1341,390 +1381,14 @@
                 <w:szCs w:val="24"/>
               </w:rPr>
             </w:pPr>
-          </w:p>
-        </w:tc>
-      </w:tr>
-      <w:tr>
-        <w:trPr>
-          <w:jc w:val="center"/>
-        </w:trPr>
-        <w:tc>
-          <w:tcPr>
-            <w:tcW w:w="990" w:type="dxa"/>
-            <w:tcBorders>
-              <w:top w:val="single" w:sz="4" w:space="0" w:color="auto"/>
-              <w:left w:val="single" w:sz="4" w:space="0" w:color="auto"/>
-              <w:bottom w:val="single" w:sz="4" w:space="0" w:color="auto"/>
-              <w:right w:val="single" w:sz="4" w:space="0" w:color="auto"/>
-            </w:tcBorders>
-          </w:tcPr>
-          <w:p>
-            <w:pPr>
-              <w:spacing w:after="0" w:line="240" w:lineRule="auto"/>
-              <w:jc w:val="center"/>
-              <w:rPr>
-                <w:rFonts w:ascii="Book Antiqua" w:eastAsia="Times New Roman" w:hAnsi="Book Antiqua" w:cs="Times New Roman"/>
-                <w:sz w:val="20"/>
-                <w:szCs w:val="24"/>
-              </w:rPr>
-            </w:pPr>
-            <w:r>
-              <w:rPr>
-                <w:rFonts w:ascii="Book Antiqua" w:eastAsia="Times New Roman" w:hAnsi="Book Antiqua" w:cs="Times New Roman"/>
-                <w:sz w:val="20"/>
-                <w:szCs w:val="24"/>
-              </w:rPr>
-              <w:t xml:space="preserve">{fromDate}</w:t>
-            </w:r>
-          </w:p>
-        </w:tc>
-        <w:tc>
-          <w:tcPr>
-            <w:tcW w:w="990" w:type="dxa"/>
-            <w:tcBorders>
-              <w:top w:val="single" w:sz="4" w:space="0" w:color="auto"/>
-              <w:left w:val="single" w:sz="4" w:space="0" w:color="auto"/>
-              <w:bottom w:val="single" w:sz="4" w:space="0" w:color="auto"/>
-              <w:right w:val="single" w:sz="4" w:space="0" w:color="auto"/>
-            </w:tcBorders>
-          </w:tcPr>
-          <w:p>
-            <w:pPr>
-              <w:spacing w:after="0" w:line="240" w:lineRule="auto"/>
-              <w:jc w:val="center"/>
-              <w:rPr>
-                <w:rFonts w:ascii="Book Antiqua" w:eastAsia="Times New Roman" w:hAnsi="Book Antiqua" w:cs="Times New Roman"/>
-                <w:sz w:val="20"/>
-                <w:szCs w:val="24"/>
-              </w:rPr>
-            </w:pPr>
-            <w:r>
-              <w:rPr>
-                <w:rFonts w:ascii="Book Antiqua" w:eastAsia="Times New Roman" w:hAnsi="Book Antiqua" w:cs="Times New Roman"/>
-                <w:sz w:val="20"/>
-                <w:szCs w:val="24"/>
-              </w:rPr>
-              <w:t xml:space="preserve">{toDate}</w:t>
-            </w:r>
-          </w:p>
-        </w:tc>
-        <w:tc>
-          <w:tcPr>
-            <w:tcW w:w="1800" w:type="dxa"/>
-            <w:tcBorders>
-              <w:top w:val="single" w:sz="4" w:space="0" w:color="auto"/>
-              <w:left w:val="single" w:sz="4" w:space="0" w:color="auto"/>
-              <w:bottom w:val="single" w:sz="4" w:space="0" w:color="auto"/>
-              <w:right w:val="single" w:sz="4" w:space="0" w:color="auto"/>
-            </w:tcBorders>
-          </w:tcPr>
-          <w:p>
-            <w:pPr>
-              <w:spacing w:after="0" w:line="240" w:lineRule="auto"/>
-              <w:jc w:val="center"/>
-              <w:rPr>
-                <w:rFonts w:ascii="Book Antiqua" w:eastAsia="Times New Roman" w:hAnsi="Book Antiqua" w:cs="Times New Roman"/>
-                <w:sz w:val="20"/>
-                <w:szCs w:val="24"/>
-              </w:rPr>
-            </w:pPr>
-            <w:r>
-              <w:rPr>
-                <w:rFonts w:ascii="Book Antiqua" w:eastAsia="Times New Roman" w:hAnsi="Book Antiqua" w:cs="Times New Roman"/>
-                <w:sz w:val="20"/>
-                <w:szCs w:val="24"/>
-              </w:rPr>
-              <w:t>{designation}</w:t>
-            </w:r>
-          </w:p>
-        </w:tc>
-        <w:tc>
-          <w:tcPr>
-            <w:tcW w:w="1304" w:type="dxa"/>
-            <w:tcBorders>
-              <w:top w:val="single" w:sz="4" w:space="0" w:color="auto"/>
-              <w:left w:val="single" w:sz="4" w:space="0" w:color="auto"/>
-              <w:bottom w:val="single" w:sz="4" w:space="0" w:color="auto"/>
-              <w:right w:val="single" w:sz="4" w:space="0" w:color="auto"/>
-            </w:tcBorders>
-          </w:tcPr>
-          <w:p>
-            <w:pPr>
-              <w:spacing w:after="0" w:line="240" w:lineRule="auto"/>
-              <w:jc w:val="center"/>
-              <w:rPr>
-                <w:rFonts w:ascii="Book Antiqua" w:eastAsia="Times New Roman" w:hAnsi="Book Antiqua" w:cs="Times New Roman"/>
-                <w:sz w:val="20"/>
-                <w:szCs w:val="24"/>
-              </w:rPr>
-            </w:pPr>
-            <w:r>
-              <w:rPr>
-                <w:rFonts w:ascii="Book Antiqua" w:eastAsia="Times New Roman" w:hAnsi="Book Antiqua" w:cs="Times New Roman"/>
-                <w:sz w:val="20"/>
-                <w:szCs w:val="24"/>
-              </w:rPr>
-              <w:t>{status}</w:t>
-            </w:r>
-          </w:p>
-        </w:tc>
-        <w:tc>
-          <w:tcPr>
-            <w:tcW w:w="2116" w:type="dxa"/>
-            <w:tcBorders>
-              <w:top w:val="single" w:sz="4" w:space="0" w:color="auto"/>
-              <w:left w:val="single" w:sz="4" w:space="0" w:color="auto"/>
-              <w:bottom w:val="single" w:sz="4" w:space="0" w:color="auto"/>
-              <w:right w:val="single" w:sz="4" w:space="0" w:color="auto"/>
-            </w:tcBorders>
-          </w:tcPr>
-          <w:p>
-            <w:pPr>
-              <w:spacing w:after="0" w:line="240" w:lineRule="auto"/>
-              <w:jc w:val="center"/>
-              <w:rPr>
-                <w:rFonts w:ascii="Book Antiqua" w:eastAsia="Times New Roman" w:hAnsi="Book Antiqua" w:cs="Times New Roman"/>
-                <w:sz w:val="20"/>
-                <w:szCs w:val="24"/>
-              </w:rPr>
-            </w:pPr>
-            <w:r>
-              <w:rPr>
-                <w:rFonts w:ascii="Book Antiqua" w:eastAsia="Times New Roman" w:hAnsi="Book Antiqua" w:cs="Times New Roman"/>
-                <w:sz w:val="20"/>
-                <w:szCs w:val="24"/>
-              </w:rPr>
-              <w:t>{salary}</w:t>
-            </w:r>
-          </w:p>
-        </w:tc>
-        <w:tc>
-          <w:tcPr>
-            <w:tcW w:w="1980" w:type="dxa"/>
-            <w:tcBorders>
-              <w:top w:val="single" w:sz="4" w:space="0" w:color="auto"/>
-              <w:left w:val="single" w:sz="4" w:space="0" w:color="auto"/>
-              <w:bottom w:val="single" w:sz="4" w:space="0" w:color="auto"/>
-              <w:right w:val="single" w:sz="4" w:space="0" w:color="auto"/>
-            </w:tcBorders>
-          </w:tcPr>
-          <w:p>
-            <w:pPr>
-              <w:spacing w:after="0" w:line="240" w:lineRule="auto"/>
-              <w:jc w:val="center"/>
-              <w:rPr>
-                <w:rFonts w:ascii="Book Antiqua" w:eastAsia="Times New Roman" w:hAnsi="Book Antiqua" w:cs="Times New Roman"/>
-                <w:sz w:val="20"/>
-                <w:szCs w:val="24"/>
-              </w:rPr>
-            </w:pPr>
-            <w:r>
-              <w:rPr>
-                <w:rFonts w:ascii="Book Antiqua" w:eastAsia="Times New Roman" w:hAnsi="Book Antiqua" w:cs="Times New Roman"/>
-                <w:sz w:val="20"/>
-                <w:szCs w:val="24"/>
-              </w:rPr>
-              <w:t>{office}</w:t>
-            </w:r>
-          </w:p>
-        </w:tc>
-        <w:tc>
-          <w:tcPr>
-            <w:tcW w:w="1746" w:type="dxa"/>
-            <w:tcBorders>
-              <w:top w:val="single" w:sz="4" w:space="0" w:color="auto"/>
-              <w:left w:val="single" w:sz="4" w:space="0" w:color="auto"/>
-              <w:bottom w:val="single" w:sz="4" w:space="0" w:color="auto"/>
-              <w:right w:val="single" w:sz="4" w:space="0" w:color="auto"/>
-            </w:tcBorders>
-          </w:tcPr>
-          <w:p>
-            <w:pPr>
-              <w:spacing w:after="0" w:line="240" w:lineRule="auto"/>
-              <w:jc w:val="center"/>
-              <w:rPr>
-                <w:rFonts w:ascii="Book Antiqua" w:eastAsia="Times New Roman" w:hAnsi="Book Antiqua" w:cs="Times New Roman"/>
-                <w:sz w:val="20"/>
-                <w:szCs w:val="24"/>
-              </w:rPr>
-            </w:pPr>
-            <w:r>
-              <w:rPr>
-                <w:rFonts w:ascii="Book Antiqua" w:eastAsia="Times New Roman" w:hAnsi="Book Antiqua" w:cs="Times New Roman"/>
-                <w:sz w:val="20"/>
-                <w:szCs w:val="24"/>
-              </w:rPr>
-              <w:t>{separation}</w:t>
-            </w:r>
-          </w:p>
-        </w:tc>
-      </w:tr>
-      <w:tr>
-        <w:trPr>
-          <w:jc w:val="center"/>
-        </w:trPr>
-        <w:tc>
-          <w:tcPr>
-            <w:tcW w:w="990" w:type="dxa"/>
-            <w:tcBorders>
-              <w:top w:val="single" w:sz="4" w:space="0" w:color="auto"/>
-              <w:left w:val="single" w:sz="4" w:space="0" w:color="auto"/>
-              <w:bottom w:val="single" w:sz="4" w:space="0" w:color="auto"/>
-              <w:right w:val="single" w:sz="4" w:space="0" w:color="auto"/>
-            </w:tcBorders>
-          </w:tcPr>
-          <w:p>
-            <w:pPr>
-              <w:spacing w:after="0" w:line="240" w:lineRule="auto"/>
-              <w:jc w:val="center"/>
-              <w:rPr>
-                <w:rFonts w:ascii="Book Antiqua" w:eastAsia="Times New Roman" w:hAnsi="Book Antiqua" w:cs="Times New Roman"/>
-                <w:sz w:val="20"/>
-                <w:szCs w:val="24"/>
-              </w:rPr>
-            </w:pPr>
-            <w:r>
-              <w:rPr>
-                <w:rFonts w:ascii="Book Antiqua" w:eastAsia="Times New Roman" w:hAnsi="Book Antiqua" w:cs="Times New Roman"/>
-                <w:sz w:val="20"/>
-                <w:szCs w:val="24"/>
-              </w:rPr>
-              <w:t>{/serviceRecords}</w:t>
-            </w:r>
-            <w:bookmarkStart w:id="0" w:name="_GoBack"/>
-            <w:bookmarkEnd w:id="0"/>
-          </w:p>
-        </w:tc>
-        <w:tc>
-          <w:tcPr>
-            <w:tcW w:w="990" w:type="dxa"/>
-            <w:tcBorders>
-              <w:top w:val="single" w:sz="4" w:space="0" w:color="auto"/>
-              <w:left w:val="single" w:sz="4" w:space="0" w:color="auto"/>
-              <w:bottom w:val="single" w:sz="4" w:space="0" w:color="auto"/>
-              <w:right w:val="single" w:sz="4" w:space="0" w:color="auto"/>
-            </w:tcBorders>
-          </w:tcPr>
-          <w:p>
-            <w:pPr>
-              <w:spacing w:after="0" w:line="240" w:lineRule="auto"/>
-              <w:jc w:val="center"/>
-              <w:rPr>
-                <w:rFonts w:ascii="Book Antiqua" w:eastAsia="Times New Roman" w:hAnsi="Book Antiqua" w:cs="Times New Roman"/>
-                <w:sz w:val="20"/>
-                <w:szCs w:val="24"/>
-              </w:rPr>
-            </w:pPr>
-          </w:p>
-        </w:tc>
-        <w:tc>
-          <w:tcPr>
-            <w:tcW w:w="1800" w:type="dxa"/>
-            <w:tcBorders>
-              <w:top w:val="single" w:sz="4" w:space="0" w:color="auto"/>
-              <w:left w:val="single" w:sz="4" w:space="0" w:color="auto"/>
-              <w:bottom w:val="single" w:sz="4" w:space="0" w:color="auto"/>
-              <w:right w:val="single" w:sz="4" w:space="0" w:color="auto"/>
-            </w:tcBorders>
-          </w:tcPr>
-          <w:p>
-            <w:pPr>
-              <w:spacing w:after="0" w:line="240" w:lineRule="auto"/>
-              <w:jc w:val="center"/>
-              <w:rPr>
-                <w:rFonts w:ascii="Book Antiqua" w:eastAsia="Times New Roman" w:hAnsi="Book Antiqua" w:cs="Times New Roman"/>
-                <w:sz w:val="20"/>
-                <w:szCs w:val="24"/>
-              </w:rPr>
-            </w:pPr>
-          </w:p>
-        </w:tc>
-        <w:tc>
-          <w:tcPr>
-            <w:tcW w:w="1304" w:type="dxa"/>
-            <w:tcBorders>
-              <w:top w:val="single" w:sz="4" w:space="0" w:color="auto"/>
-              <w:left w:val="single" w:sz="4" w:space="0" w:color="auto"/>
-              <w:bottom w:val="single" w:sz="4" w:space="0" w:color="auto"/>
-              <w:right w:val="single" w:sz="4" w:space="0" w:color="auto"/>
-            </w:tcBorders>
-          </w:tcPr>
-          <w:p>
-            <w:pPr>
-              <w:spacing w:after="0" w:line="240" w:lineRule="auto"/>
-              <w:jc w:val="center"/>
-              <w:rPr>
-                <w:rFonts w:ascii="Book Antiqua" w:eastAsia="Times New Roman" w:hAnsi="Book Antiqua" w:cs="Times New Roman"/>
-                <w:sz w:val="20"/>
-                <w:szCs w:val="24"/>
-              </w:rPr>
-            </w:pPr>
-          </w:p>
-        </w:tc>
-        <w:tc>
-          <w:tcPr>
-            <w:tcW w:w="2116" w:type="dxa"/>
-            <w:tcBorders>
-              <w:top w:val="single" w:sz="4" w:space="0" w:color="auto"/>
-              <w:left w:val="single" w:sz="4" w:space="0" w:color="auto"/>
-              <w:bottom w:val="single" w:sz="4" w:space="0" w:color="auto"/>
-              <w:right w:val="single" w:sz="4" w:space="0" w:color="auto"/>
-            </w:tcBorders>
-          </w:tcPr>
-          <w:p>
-            <w:pPr>
-              <w:spacing w:after="0" w:line="240" w:lineRule="auto"/>
-              <w:jc w:val="center"/>
-              <w:rPr>
-                <w:rFonts w:ascii="Book Antiqua" w:eastAsia="Times New Roman" w:hAnsi="Book Antiqua" w:cs="Times New Roman"/>
-                <w:sz w:val="20"/>
-                <w:szCs w:val="24"/>
-              </w:rPr>
-            </w:pPr>
-          </w:p>
-        </w:tc>
-        <w:tc>
-          <w:tcPr>
-            <w:tcW w:w="1980" w:type="dxa"/>
-            <w:tcBorders>
-              <w:top w:val="single" w:sz="4" w:space="0" w:color="auto"/>
-              <w:left w:val="single" w:sz="4" w:space="0" w:color="auto"/>
-              <w:bottom w:val="single" w:sz="4" w:space="0" w:color="auto"/>
-              <w:right w:val="single" w:sz="4" w:space="0" w:color="auto"/>
-            </w:tcBorders>
-          </w:tcPr>
-          <w:p>
-            <w:pPr>
-              <w:spacing w:after="0" w:line="240" w:lineRule="auto"/>
-              <w:jc w:val="center"/>
-              <w:rPr>
-                <w:rFonts w:ascii="Book Antiqua" w:eastAsia="Times New Roman" w:hAnsi="Book Antiqua" w:cs="Times New Roman"/>
-                <w:sz w:val="20"/>
-                <w:szCs w:val="24"/>
-              </w:rPr>
-            </w:pPr>
-          </w:p>
-        </w:tc>
-        <w:tc>
-          <w:tcPr>
-            <w:tcW w:w="1746" w:type="dxa"/>
-            <w:tcBorders>
-              <w:top w:val="single" w:sz="4" w:space="0" w:color="auto"/>
-              <w:left w:val="single" w:sz="4" w:space="0" w:color="auto"/>
-              <w:bottom w:val="single" w:sz="4" w:space="0" w:color="auto"/>
-              <w:right w:val="single" w:sz="4" w:space="0" w:color="auto"/>
-            </w:tcBorders>
-          </w:tcPr>
-          <w:p>
-            <w:pPr>
-              <w:spacing w:after="0" w:line="240" w:lineRule="auto"/>
-              <w:jc w:val="center"/>
-              <w:rPr>
-                <w:rFonts w:ascii="Book Antiqua" w:eastAsia="Times New Roman" w:hAnsi="Book Antiqua" w:cs="Times New Roman"/>
-                <w:sz w:val="20"/>
-                <w:szCs w:val="24"/>
-              </w:rPr>
-            </w:pPr>
+            <w:r>
+              <w:rPr>
+                <w:rFonts w:ascii="Book Antiqua" w:eastAsia="Times New Roman" w:hAnsi="Book Antiqua" w:cs="Times New Roman"/>
+                <w:sz w:val="20"/>
+                <w:szCs w:val="24"/>
+              </w:rPr>
+              <w:t>{separation}{/serviceRecords}</w:t>
+            </w:r>
           </w:p>
         </w:tc>
       </w:tr>

</xml_diff>

<commit_message>
Shrink service record table font from 10pt to 8pt to fit cell widths
Long designation/office text was overflowing the table's narrow
columns at 10pt. Drop to 8pt for the data row only.

Co-Authored-By: Claude Sonnet 5 <noreply@anthropic.com>
</commit_message>
<xml_diff>
--- a/apps/api/templates/service_record_template.docx
+++ b/apps/api/templates/service_record_template.docx
@@ -1197,15 +1197,15 @@
               <w:jc w:val="center"/>
               <w:rPr>
                 <w:rFonts w:ascii="Book Antiqua" w:eastAsia="Times New Roman" w:hAnsi="Book Antiqua" w:cs="Times New Roman"/>
-                <w:sz w:val="20"/>
-                <w:szCs w:val="24"/>
-              </w:rPr>
-            </w:pPr>
-            <w:r>
-              <w:rPr>
-                <w:rFonts w:ascii="Book Antiqua" w:eastAsia="Times New Roman" w:hAnsi="Book Antiqua" w:cs="Times New Roman"/>
-                <w:sz w:val="20"/>
-                <w:szCs w:val="24"/>
+                <w:sz w:val="16"/>
+                <w:szCs w:val="16"/>
+              </w:rPr>
+            </w:pPr>
+            <w:r>
+              <w:rPr>
+                <w:rFonts w:ascii="Book Antiqua" w:eastAsia="Times New Roman" w:hAnsi="Book Antiqua" w:cs="Times New Roman"/>
+                <w:sz w:val="16"/>
+                <w:szCs w:val="16"/>
               </w:rPr>
               <w:t xml:space="preserve">{#serviceRecords}{fromDate}</w:t>
             </w:r>
@@ -1227,15 +1227,15 @@
               <w:jc w:val="center"/>
               <w:rPr>
                 <w:rFonts w:ascii="Book Antiqua" w:eastAsia="Times New Roman" w:hAnsi="Book Antiqua" w:cs="Times New Roman"/>
-                <w:sz w:val="20"/>
-                <w:szCs w:val="24"/>
-              </w:rPr>
-            </w:pPr>
-            <w:r>
-              <w:rPr>
-                <w:rFonts w:ascii="Book Antiqua" w:eastAsia="Times New Roman" w:hAnsi="Book Antiqua" w:cs="Times New Roman"/>
-                <w:sz w:val="20"/>
-                <w:szCs w:val="24"/>
+                <w:sz w:val="16"/>
+                <w:szCs w:val="16"/>
+              </w:rPr>
+            </w:pPr>
+            <w:r>
+              <w:rPr>
+                <w:rFonts w:ascii="Book Antiqua" w:eastAsia="Times New Roman" w:hAnsi="Book Antiqua" w:cs="Times New Roman"/>
+                <w:sz w:val="16"/>
+                <w:szCs w:val="16"/>
               </w:rPr>
               <w:t xml:space="preserve">{toDate}</w:t>
             </w:r>
@@ -1257,15 +1257,15 @@
               <w:jc w:val="center"/>
               <w:rPr>
                 <w:rFonts w:ascii="Book Antiqua" w:eastAsia="Times New Roman" w:hAnsi="Book Antiqua" w:cs="Times New Roman"/>
-                <w:sz w:val="20"/>
-                <w:szCs w:val="24"/>
-              </w:rPr>
-            </w:pPr>
-            <w:r>
-              <w:rPr>
-                <w:rFonts w:ascii="Book Antiqua" w:eastAsia="Times New Roman" w:hAnsi="Book Antiqua" w:cs="Times New Roman"/>
-                <w:sz w:val="20"/>
-                <w:szCs w:val="24"/>
+                <w:sz w:val="16"/>
+                <w:szCs w:val="16"/>
+              </w:rPr>
+            </w:pPr>
+            <w:r>
+              <w:rPr>
+                <w:rFonts w:ascii="Book Antiqua" w:eastAsia="Times New Roman" w:hAnsi="Book Antiqua" w:cs="Times New Roman"/>
+                <w:sz w:val="16"/>
+                <w:szCs w:val="16"/>
               </w:rPr>
               <w:t>{designation}</w:t>
             </w:r>
@@ -1287,15 +1287,15 @@
               <w:jc w:val="center"/>
               <w:rPr>
                 <w:rFonts w:ascii="Book Antiqua" w:eastAsia="Times New Roman" w:hAnsi="Book Antiqua" w:cs="Times New Roman"/>
-                <w:sz w:val="20"/>
-                <w:szCs w:val="24"/>
-              </w:rPr>
-            </w:pPr>
-            <w:r>
-              <w:rPr>
-                <w:rFonts w:ascii="Book Antiqua" w:eastAsia="Times New Roman" w:hAnsi="Book Antiqua" w:cs="Times New Roman"/>
-                <w:sz w:val="20"/>
-                <w:szCs w:val="24"/>
+                <w:sz w:val="16"/>
+                <w:szCs w:val="16"/>
+              </w:rPr>
+            </w:pPr>
+            <w:r>
+              <w:rPr>
+                <w:rFonts w:ascii="Book Antiqua" w:eastAsia="Times New Roman" w:hAnsi="Book Antiqua" w:cs="Times New Roman"/>
+                <w:sz w:val="16"/>
+                <w:szCs w:val="16"/>
               </w:rPr>
               <w:t>{status}</w:t>
             </w:r>
@@ -1317,15 +1317,15 @@
               <w:jc w:val="center"/>
               <w:rPr>
                 <w:rFonts w:ascii="Book Antiqua" w:eastAsia="Times New Roman" w:hAnsi="Book Antiqua" w:cs="Times New Roman"/>
-                <w:sz w:val="20"/>
-                <w:szCs w:val="24"/>
-              </w:rPr>
-            </w:pPr>
-            <w:r>
-              <w:rPr>
-                <w:rFonts w:ascii="Book Antiqua" w:eastAsia="Times New Roman" w:hAnsi="Book Antiqua" w:cs="Times New Roman"/>
-                <w:sz w:val="20"/>
-                <w:szCs w:val="24"/>
+                <w:sz w:val="16"/>
+                <w:szCs w:val="16"/>
+              </w:rPr>
+            </w:pPr>
+            <w:r>
+              <w:rPr>
+                <w:rFonts w:ascii="Book Antiqua" w:eastAsia="Times New Roman" w:hAnsi="Book Antiqua" w:cs="Times New Roman"/>
+                <w:sz w:val="16"/>
+                <w:szCs w:val="16"/>
               </w:rPr>
               <w:t>{salary}</w:t>
             </w:r>
@@ -1347,15 +1347,15 @@
               <w:jc w:val="center"/>
               <w:rPr>
                 <w:rFonts w:ascii="Book Antiqua" w:eastAsia="Times New Roman" w:hAnsi="Book Antiqua" w:cs="Times New Roman"/>
-                <w:sz w:val="20"/>
-                <w:szCs w:val="24"/>
-              </w:rPr>
-            </w:pPr>
-            <w:r>
-              <w:rPr>
-                <w:rFonts w:ascii="Book Antiqua" w:eastAsia="Times New Roman" w:hAnsi="Book Antiqua" w:cs="Times New Roman"/>
-                <w:sz w:val="20"/>
-                <w:szCs w:val="24"/>
+                <w:sz w:val="16"/>
+                <w:szCs w:val="16"/>
+              </w:rPr>
+            </w:pPr>
+            <w:r>
+              <w:rPr>
+                <w:rFonts w:ascii="Book Antiqua" w:eastAsia="Times New Roman" w:hAnsi="Book Antiqua" w:cs="Times New Roman"/>
+                <w:sz w:val="16"/>
+                <w:szCs w:val="16"/>
               </w:rPr>
               <w:t>{office}</w:t>
             </w:r>
@@ -1377,15 +1377,15 @@
               <w:jc w:val="center"/>
               <w:rPr>
                 <w:rFonts w:ascii="Book Antiqua" w:eastAsia="Times New Roman" w:hAnsi="Book Antiqua" w:cs="Times New Roman"/>
-                <w:sz w:val="20"/>
-                <w:szCs w:val="24"/>
-              </w:rPr>
-            </w:pPr>
-            <w:r>
-              <w:rPr>
-                <w:rFonts w:ascii="Book Antiqua" w:eastAsia="Times New Roman" w:hAnsi="Book Antiqua" w:cs="Times New Roman"/>
-                <w:sz w:val="20"/>
-                <w:szCs w:val="24"/>
+                <w:sz w:val="16"/>
+                <w:szCs w:val="16"/>
+              </w:rPr>
+            </w:pPr>
+            <w:r>
+              <w:rPr>
+                <w:rFonts w:ascii="Book Antiqua" w:eastAsia="Times New Roman" w:hAnsi="Book Antiqua" w:cs="Times New Roman"/>
+                <w:sz w:val="16"/>
+                <w:szCs w:val="16"/>
               </w:rPr>
               <w:t>{separation}{/serviceRecords}</w:t>
             </w:r>

</xml_diff>